<commit_message>
Contrôleur HA : boîtier imprimé (OpenSCAD + STL), antennes LoRa/Wi-Fi internes
Home-Assist/boitier : boitier_controleur.scad (Customizer), STL de la boîte et
du couvercle, 6 aperçus, fiche Boîtier contrôleur HA (.md/.docx).
Posé sur étagère, couvercle vissé, interrupteur + LED en façade, jack et SMA
433 à l'arrière, USB-C à droite, DHT20 vissé dehors à gauche, aération.
Hauteurs des modules estimées : à mesurer avant impression (fiche § 5).
pcb : antenne LoRa souple interne (plus de SMA de traversée ni d'antenne
868 externe), liste des composants complétée (vis, patins, DHT20).

Co-Authored-By: Claude Opus 5.5 <noreply@anthropic.com>
</commit_message>
<xml_diff>
--- a/Home-Assist/pcb/Controleur_Composants.docx
+++ b/Home-Assist/pcb/Controleur_Composants.docx
@@ -2042,9 +2042,9 @@
         </w:tblBorders>
       </w:tblPr>
       <w:tblGrid>
-        <w:gridCol w:w="3641"/>
-        <w:gridCol w:w="286"/>
-        <w:gridCol w:w="5711"/>
+        <w:gridCol w:w="3234"/>
+        <w:gridCol w:w="254"/>
+        <w:gridCol w:w="6150"/>
       </w:tblGrid>
       <w:tr>
         <w:trPr>
@@ -2052,7 +2052,7 @@
         </w:trPr>
         <w:tc>
           <w:tcPr>
-            <w:tcW w:type="dxa" w:w="3641"/>
+            <w:tcW w:type="dxa" w:w="3234"/>
             <w:tcBorders>
               <w:top w:val="single" w:color="999999" w:sz="4"/>
               <w:left w:val="single" w:color="999999" w:sz="4"/>
@@ -2079,7 +2079,7 @@
         </w:tc>
         <w:tc>
           <w:tcPr>
-            <w:tcW w:type="dxa" w:w="286"/>
+            <w:tcW w:type="dxa" w:w="254"/>
             <w:tcBorders>
               <w:top w:val="single" w:color="999999" w:sz="4"/>
               <w:left w:val="single" w:color="999999" w:sz="4"/>
@@ -2106,7 +2106,7 @@
         </w:tc>
         <w:tc>
           <w:tcPr>
-            <w:tcW w:type="dxa" w:w="5711"/>
+            <w:tcW w:type="dxa" w:w="6150"/>
             <w:tcBorders>
               <w:top w:val="single" w:color="999999" w:sz="4"/>
               <w:left w:val="single" w:color="999999" w:sz="4"/>
@@ -2138,7 +2138,7 @@
         </w:trPr>
         <w:tc>
           <w:tcPr>
-            <w:tcW w:type="dxa" w:w="3641"/>
+            <w:tcW w:type="dxa" w:w="3234"/>
             <w:tcBorders>
               <w:top w:val="single" w:color="999999" w:sz="4"/>
               <w:left w:val="single" w:color="999999" w:sz="4"/>
@@ -2160,7 +2160,7 @@
         </w:tc>
         <w:tc>
           <w:tcPr>
-            <w:tcW w:type="dxa" w:w="286"/>
+            <w:tcW w:type="dxa" w:w="254"/>
             <w:tcBorders>
               <w:top w:val="single" w:color="999999" w:sz="4"/>
               <w:left w:val="single" w:color="999999" w:sz="4"/>
@@ -2182,7 +2182,7 @@
         </w:tc>
         <w:tc>
           <w:tcPr>
-            <w:tcW w:type="dxa" w:w="5711"/>
+            <w:tcW w:type="dxa" w:w="6150"/>
             <w:tcBorders>
               <w:top w:val="single" w:color="999999" w:sz="4"/>
               <w:left w:val="single" w:color="999999" w:sz="4"/>
@@ -2209,7 +2209,7 @@
         </w:trPr>
         <w:tc>
           <w:tcPr>
-            <w:tcW w:type="dxa" w:w="3641"/>
+            <w:tcW w:type="dxa" w:w="3234"/>
             <w:tcBorders>
               <w:top w:val="single" w:color="999999" w:sz="4"/>
               <w:left w:val="single" w:color="999999" w:sz="4"/>
@@ -2231,7 +2231,7 @@
         </w:tc>
         <w:tc>
           <w:tcPr>
-            <w:tcW w:type="dxa" w:w="286"/>
+            <w:tcW w:type="dxa" w:w="254"/>
             <w:tcBorders>
               <w:top w:val="single" w:color="999999" w:sz="4"/>
               <w:left w:val="single" w:color="999999" w:sz="4"/>
@@ -2253,7 +2253,7 @@
         </w:tc>
         <w:tc>
           <w:tcPr>
-            <w:tcW w:type="dxa" w:w="5711"/>
+            <w:tcW w:type="dxa" w:w="6150"/>
             <w:tcBorders>
               <w:top w:val="single" w:color="999999" w:sz="4"/>
               <w:left w:val="single" w:color="999999" w:sz="4"/>
@@ -2280,7 +2280,7 @@
         </w:trPr>
         <w:tc>
           <w:tcPr>
-            <w:tcW w:type="dxa" w:w="3641"/>
+            <w:tcW w:type="dxa" w:w="3234"/>
             <w:tcBorders>
               <w:top w:val="single" w:color="999999" w:sz="4"/>
               <w:left w:val="single" w:color="999999" w:sz="4"/>
@@ -2302,7 +2302,7 @@
         </w:tc>
         <w:tc>
           <w:tcPr>
-            <w:tcW w:type="dxa" w:w="286"/>
+            <w:tcW w:type="dxa" w:w="254"/>
             <w:tcBorders>
               <w:top w:val="single" w:color="999999" w:sz="4"/>
               <w:left w:val="single" w:color="999999" w:sz="4"/>
@@ -2324,7 +2324,7 @@
         </w:tc>
         <w:tc>
           <w:tcPr>
-            <w:tcW w:type="dxa" w:w="5711"/>
+            <w:tcW w:type="dxa" w:w="6150"/>
             <w:tcBorders>
               <w:top w:val="single" w:color="999999" w:sz="4"/>
               <w:left w:val="single" w:color="999999" w:sz="4"/>
@@ -2351,7 +2351,7 @@
         </w:trPr>
         <w:tc>
           <w:tcPr>
-            <w:tcW w:type="dxa" w:w="3641"/>
+            <w:tcW w:type="dxa" w:w="3234"/>
             <w:tcBorders>
               <w:top w:val="single" w:color="999999" w:sz="4"/>
               <w:left w:val="single" w:color="999999" w:sz="4"/>
@@ -2373,7 +2373,7 @@
         </w:tc>
         <w:tc>
           <w:tcPr>
-            <w:tcW w:type="dxa" w:w="286"/>
+            <w:tcW w:type="dxa" w:w="254"/>
             <w:tcBorders>
               <w:top w:val="single" w:color="999999" w:sz="4"/>
               <w:left w:val="single" w:color="999999" w:sz="4"/>
@@ -2395,7 +2395,7 @@
         </w:tc>
         <w:tc>
           <w:tcPr>
-            <w:tcW w:type="dxa" w:w="5711"/>
+            <w:tcW w:type="dxa" w:w="6150"/>
             <w:tcBorders>
               <w:top w:val="single" w:color="999999" w:sz="4"/>
               <w:left w:val="single" w:color="999999" w:sz="4"/>
@@ -2422,7 +2422,7 @@
         </w:trPr>
         <w:tc>
           <w:tcPr>
-            <w:tcW w:type="dxa" w:w="3641"/>
+            <w:tcW w:type="dxa" w:w="3234"/>
             <w:tcBorders>
               <w:top w:val="single" w:color="999999" w:sz="4"/>
               <w:left w:val="single" w:color="999999" w:sz="4"/>
@@ -2444,7 +2444,7 @@
         </w:tc>
         <w:tc>
           <w:tcPr>
-            <w:tcW w:type="dxa" w:w="286"/>
+            <w:tcW w:type="dxa" w:w="254"/>
             <w:tcBorders>
               <w:top w:val="single" w:color="999999" w:sz="4"/>
               <w:left w:val="single" w:color="999999" w:sz="4"/>
@@ -2466,23 +2466,23 @@
         </w:tc>
         <w:tc>
           <w:tcPr>
-            <w:tcW w:type="dxa" w:w="5711"/>
-            <w:tcBorders>
-              <w:top w:val="single" w:color="999999" w:sz="4"/>
-              <w:left w:val="single" w:color="999999" w:sz="4"/>
-              <w:bottom w:val="single" w:color="999999" w:sz="4"/>
-              <w:right w:val="single" w:color="999999" w:sz="4"/>
-            </w:tcBorders>
-            <w:tcMar>
-              <w:top w:type="dxa" w:w="60"/>
-              <w:left w:type="dxa" w:w="100"/>
-              <w:bottom w:type="dxa" w:w="60"/>
-              <w:right w:type="dxa" w:w="100"/>
-            </w:tcMar>
-          </w:tcPr>
-          <w:p>
-            <w:r>
-              <w:t xml:space="preserve">contre la paroi gauche du boîtier (fentes), câble JST-XH 4 broches serti vers J3</w:t>
+            <w:tcW w:type="dxa" w:w="6150"/>
+            <w:tcBorders>
+              <w:top w:val="single" w:color="999999" w:sz="4"/>
+              <w:left w:val="single" w:color="999999" w:sz="4"/>
+              <w:bottom w:val="single" w:color="999999" w:sz="4"/>
+              <w:right w:val="single" w:color="999999" w:sz="4"/>
+            </w:tcBorders>
+            <w:tcMar>
+              <w:top w:type="dxa" w:w="60"/>
+              <w:left w:type="dxa" w:w="100"/>
+              <w:bottom w:type="dxa" w:w="60"/>
+              <w:right w:type="dxa" w:w="100"/>
+            </w:tcMar>
+          </w:tcPr>
+          <w:p>
+            <w:r>
+              <w:t xml:space="preserve">vissé à l'extérieur de la paroi gauche (vis M3 × 8 + écrou), câble par un trou vers J3 (JST-XH 4)</w:t>
             </w:r>
           </w:p>
         </w:tc>
@@ -2493,7 +2493,7 @@
         </w:trPr>
         <w:tc>
           <w:tcPr>
-            <w:tcW w:type="dxa" w:w="3641"/>
+            <w:tcW w:type="dxa" w:w="3234"/>
             <w:tcBorders>
               <w:top w:val="single" w:color="999999" w:sz="4"/>
               <w:left w:val="single" w:color="999999" w:sz="4"/>
@@ -2515,7 +2515,7 @@
         </w:tc>
         <w:tc>
           <w:tcPr>
-            <w:tcW w:type="dxa" w:w="286"/>
+            <w:tcW w:type="dxa" w:w="254"/>
             <w:tcBorders>
               <w:top w:val="single" w:color="999999" w:sz="4"/>
               <w:left w:val="single" w:color="999999" w:sz="4"/>
@@ -2537,7 +2537,7 @@
         </w:tc>
         <w:tc>
           <w:tcPr>
-            <w:tcW w:type="dxa" w:w="5711"/>
+            <w:tcW w:type="dxa" w:w="6150"/>
             <w:tcBorders>
               <w:top w:val="single" w:color="999999" w:sz="4"/>
               <w:left w:val="single" w:color="999999" w:sz="4"/>
@@ -2564,7 +2564,7 @@
         </w:trPr>
         <w:tc>
           <w:tcPr>
-            <w:tcW w:type="dxa" w:w="3641"/>
+            <w:tcW w:type="dxa" w:w="3234"/>
             <w:tcBorders>
               <w:top w:val="single" w:color="999999" w:sz="4"/>
               <w:left w:val="single" w:color="999999" w:sz="4"/>
@@ -2586,7 +2586,7 @@
         </w:tc>
         <w:tc>
           <w:tcPr>
-            <w:tcW w:type="dxa" w:w="286"/>
+            <w:tcW w:type="dxa" w:w="254"/>
             <w:tcBorders>
               <w:top w:val="single" w:color="999999" w:sz="4"/>
               <w:left w:val="single" w:color="999999" w:sz="4"/>
@@ -2608,7 +2608,7 @@
         </w:tc>
         <w:tc>
           <w:tcPr>
-            <w:tcW w:type="dxa" w:w="5711"/>
+            <w:tcW w:type="dxa" w:w="6150"/>
             <w:tcBorders>
               <w:top w:val="single" w:color="999999" w:sz="4"/>
               <w:left w:val="single" w:color="999999" w:sz="4"/>
@@ -2635,29 +2635,29 @@
         </w:trPr>
         <w:tc>
           <w:tcPr>
-            <w:tcW w:type="dxa" w:w="3641"/>
-            <w:tcBorders>
-              <w:top w:val="single" w:color="999999" w:sz="4"/>
-              <w:left w:val="single" w:color="999999" w:sz="4"/>
-              <w:bottom w:val="single" w:color="999999" w:sz="4"/>
-              <w:right w:val="single" w:color="999999" w:sz="4"/>
-            </w:tcBorders>
-            <w:tcMar>
-              <w:top w:type="dxa" w:w="60"/>
-              <w:left w:type="dxa" w:w="100"/>
-              <w:bottom w:type="dxa" w:w="60"/>
-              <w:right w:type="dxa" w:w="100"/>
-            </w:tcMar>
-          </w:tcPr>
-          <w:p>
-            <w:r>
-              <w:t xml:space="preserve">Câble U.FL → SMA femelle de traversée (≈ 10 cm)</w:t>
-            </w:r>
-          </w:p>
-        </w:tc>
-        <w:tc>
-          <w:tcPr>
-            <w:tcW w:type="dxa" w:w="286"/>
+            <w:tcW w:type="dxa" w:w="3234"/>
+            <w:tcBorders>
+              <w:top w:val="single" w:color="999999" w:sz="4"/>
+              <w:left w:val="single" w:color="999999" w:sz="4"/>
+              <w:bottom w:val="single" w:color="999999" w:sz="4"/>
+              <w:right w:val="single" w:color="999999" w:sz="4"/>
+            </w:tcBorders>
+            <w:tcMar>
+              <w:top w:type="dxa" w:w="60"/>
+              <w:left w:type="dxa" w:w="100"/>
+              <w:bottom w:type="dxa" w:w="60"/>
+              <w:right w:type="dxa" w:w="100"/>
+            </w:tcMar>
+          </w:tcPr>
+          <w:p>
+            <w:r>
+              <w:t xml:space="preserve">Antenne LoRa souple U.FL 40 × 10 mm</w:t>
+            </w:r>
+          </w:p>
+        </w:tc>
+        <w:tc>
+          <w:tcPr>
+            <w:tcW w:type="dxa" w:w="254"/>
             <w:tcBorders>
               <w:top w:val="single" w:color="999999" w:sz="4"/>
               <w:left w:val="single" w:color="999999" w:sz="4"/>
@@ -2679,23 +2679,23 @@
         </w:tc>
         <w:tc>
           <w:tcPr>
-            <w:tcW w:type="dxa" w:w="5711"/>
-            <w:tcBorders>
-              <w:top w:val="single" w:color="999999" w:sz="4"/>
-              <w:left w:val="single" w:color="999999" w:sz="4"/>
-              <w:bottom w:val="single" w:color="999999" w:sz="4"/>
-              <w:right w:val="single" w:color="999999" w:sz="4"/>
-            </w:tcBorders>
-            <w:tcMar>
-              <w:top w:type="dxa" w:w="60"/>
-              <w:left w:type="dxa" w:w="100"/>
-              <w:bottom w:type="dxa" w:w="60"/>
-              <w:right w:type="dxa" w:w="100"/>
-            </w:tcMar>
-          </w:tcPr>
-          <w:p>
-            <w:r>
-              <w:t xml:space="preserve">antenne LoRa sortie sur la paroi arrière</w:t>
+            <w:tcW w:type="dxa" w:w="6150"/>
+            <w:tcBorders>
+              <w:top w:val="single" w:color="999999" w:sz="4"/>
+              <w:left w:val="single" w:color="999999" w:sz="4"/>
+              <w:bottom w:val="single" w:color="999999" w:sz="4"/>
+              <w:right w:val="single" w:color="999999" w:sz="4"/>
+            </w:tcBorders>
+            <w:tcMar>
+              <w:top w:type="dxa" w:w="60"/>
+              <w:left w:type="dxa" w:w="100"/>
+              <w:bottom w:type="dxa" w:w="60"/>
+              <w:right w:type="dxa" w:w="100"/>
+            </w:tcMar>
+          </w:tcPr>
+          <w:p>
+            <w:r>
+              <w:t xml:space="preserve">fournie avec le kit Wio-SX1262, collée en haut de la paroi droite</w:t>
             </w:r>
           </w:p>
         </w:tc>
@@ -2706,29 +2706,29 @@
         </w:trPr>
         <w:tc>
           <w:tcPr>
-            <w:tcW w:type="dxa" w:w="3641"/>
-            <w:tcBorders>
-              <w:top w:val="single" w:color="999999" w:sz="4"/>
-              <w:left w:val="single" w:color="999999" w:sz="4"/>
-              <w:bottom w:val="single" w:color="999999" w:sz="4"/>
-              <w:right w:val="single" w:color="999999" w:sz="4"/>
-            </w:tcBorders>
-            <w:tcMar>
-              <w:top w:type="dxa" w:w="60"/>
-              <w:left w:type="dxa" w:w="100"/>
-              <w:bottom w:type="dxa" w:w="60"/>
-              <w:right w:type="dxa" w:w="100"/>
-            </w:tcMar>
-          </w:tcPr>
-          <w:p>
-            <w:r>
-              <w:t xml:space="preserve">Antenne LoRa 868 MHz SMA</w:t>
-            </w:r>
-          </w:p>
-        </w:tc>
-        <w:tc>
-          <w:tcPr>
-            <w:tcW w:type="dxa" w:w="286"/>
+            <w:tcW w:type="dxa" w:w="3234"/>
+            <w:tcBorders>
+              <w:top w:val="single" w:color="999999" w:sz="4"/>
+              <w:left w:val="single" w:color="999999" w:sz="4"/>
+              <w:bottom w:val="single" w:color="999999" w:sz="4"/>
+              <w:right w:val="single" w:color="999999" w:sz="4"/>
+            </w:tcBorders>
+            <w:tcMar>
+              <w:top w:type="dxa" w:w="60"/>
+              <w:left w:type="dxa" w:w="100"/>
+              <w:bottom w:type="dxa" w:w="60"/>
+              <w:right w:type="dxa" w:w="100"/>
+            </w:tcMar>
+          </w:tcPr>
+          <w:p>
+            <w:r>
+              <w:t xml:space="preserve">Antenne Wi-Fi souple U.FL 40 × 20 mm</w:t>
+            </w:r>
+          </w:p>
+        </w:tc>
+        <w:tc>
+          <w:tcPr>
+            <w:tcW w:type="dxa" w:w="254"/>
             <w:tcBorders>
               <w:top w:val="single" w:color="999999" w:sz="4"/>
               <w:left w:val="single" w:color="999999" w:sz="4"/>
@@ -2750,23 +2750,23 @@
         </w:tc>
         <w:tc>
           <w:tcPr>
-            <w:tcW w:type="dxa" w:w="5711"/>
-            <w:tcBorders>
-              <w:top w:val="single" w:color="999999" w:sz="4"/>
-              <w:left w:val="single" w:color="999999" w:sz="4"/>
-              <w:bottom w:val="single" w:color="999999" w:sz="4"/>
-              <w:right w:val="single" w:color="999999" w:sz="4"/>
-            </w:tcBorders>
-            <w:tcMar>
-              <w:top w:type="dxa" w:w="60"/>
-              <w:left w:type="dxa" w:w="100"/>
-              <w:bottom w:type="dxa" w:w="60"/>
-              <w:right w:type="dxa" w:w="100"/>
-            </w:tcMar>
-          </w:tcPr>
-          <w:p>
-            <w:r>
-              <w:t xml:space="preserve">vérifier la bande de l'antenne du kit Wio-SX1262</w:t>
+            <w:tcW w:type="dxa" w:w="6150"/>
+            <w:tcBorders>
+              <w:top w:val="single" w:color="999999" w:sz="4"/>
+              <w:left w:val="single" w:color="999999" w:sz="4"/>
+              <w:bottom w:val="single" w:color="999999" w:sz="4"/>
+              <w:right w:val="single" w:color="999999" w:sz="4"/>
+            </w:tcBorders>
+            <w:tcMar>
+              <w:top w:type="dxa" w:w="60"/>
+              <w:left w:type="dxa" w:w="100"/>
+              <w:bottom w:type="dxa" w:w="60"/>
+              <w:right w:type="dxa" w:w="100"/>
+            </w:tcMar>
+          </w:tcPr>
+          <w:p>
+            <w:r>
+              <w:t xml:space="preserve">fournie avec le XIAO ESP32-S3, collée contre la paroi gauche</w:t>
             </w:r>
           </w:p>
         </w:tc>
@@ -2777,29 +2777,29 @@
         </w:trPr>
         <w:tc>
           <w:tcPr>
-            <w:tcW w:type="dxa" w:w="3641"/>
-            <w:tcBorders>
-              <w:top w:val="single" w:color="999999" w:sz="4"/>
-              <w:left w:val="single" w:color="999999" w:sz="4"/>
-              <w:bottom w:val="single" w:color="999999" w:sz="4"/>
-              <w:right w:val="single" w:color="999999" w:sz="4"/>
-            </w:tcBorders>
-            <w:tcMar>
-              <w:top w:type="dxa" w:w="60"/>
-              <w:left w:type="dxa" w:w="100"/>
-              <w:bottom w:type="dxa" w:w="60"/>
-              <w:right w:type="dxa" w:w="100"/>
-            </w:tcMar>
-          </w:tcPr>
-          <w:p>
-            <w:r>
-              <w:t xml:space="preserve">Antenne Wi-Fi U.FL</w:t>
-            </w:r>
-          </w:p>
-        </w:tc>
-        <w:tc>
-          <w:tcPr>
-            <w:tcW w:type="dxa" w:w="286"/>
+            <w:tcW w:type="dxa" w:w="3234"/>
+            <w:tcBorders>
+              <w:top w:val="single" w:color="999999" w:sz="4"/>
+              <w:left w:val="single" w:color="999999" w:sz="4"/>
+              <w:bottom w:val="single" w:color="999999" w:sz="4"/>
+              <w:right w:val="single" w:color="999999" w:sz="4"/>
+            </w:tcBorders>
+            <w:tcMar>
+              <w:top w:type="dxa" w:w="60"/>
+              <w:left w:type="dxa" w:w="100"/>
+              <w:bottom w:type="dxa" w:w="60"/>
+              <w:right w:type="dxa" w:w="100"/>
+            </w:tcMar>
+          </w:tcPr>
+          <w:p>
+            <w:r>
+              <w:t xml:space="preserve">Boîtier imprimé en 3D</w:t>
+            </w:r>
+          </w:p>
+        </w:tc>
+        <w:tc>
+          <w:tcPr>
+            <w:tcW w:type="dxa" w:w="254"/>
             <w:tcBorders>
               <w:top w:val="single" w:color="999999" w:sz="4"/>
               <w:left w:val="single" w:color="999999" w:sz="4"/>
@@ -2821,23 +2821,31 @@
         </w:tc>
         <w:tc>
           <w:tcPr>
-            <w:tcW w:type="dxa" w:w="5711"/>
-            <w:tcBorders>
-              <w:top w:val="single" w:color="999999" w:sz="4"/>
-              <w:left w:val="single" w:color="999999" w:sz="4"/>
-              <w:bottom w:val="single" w:color="999999" w:sz="4"/>
-              <w:right w:val="single" w:color="999999" w:sz="4"/>
-            </w:tcBorders>
-            <w:tcMar>
-              <w:top w:type="dxa" w:w="60"/>
-              <w:left w:type="dxa" w:w="100"/>
-              <w:bottom w:type="dxa" w:w="60"/>
-              <w:right w:type="dxa" w:w="100"/>
-            </w:tcMar>
-          </w:tcPr>
-          <w:p>
-            <w:r>
-              <w:t xml:space="preserve">fournie avec le XIAO ESP32-S3, collée à l'intérieur</w:t>
+            <w:tcW w:type="dxa" w:w="6150"/>
+            <w:tcBorders>
+              <w:top w:val="single" w:color="999999" w:sz="4"/>
+              <w:left w:val="single" w:color="999999" w:sz="4"/>
+              <w:bottom w:val="single" w:color="999999" w:sz="4"/>
+              <w:right w:val="single" w:color="999999" w:sz="4"/>
+            </w:tcBorders>
+            <w:tcMar>
+              <w:top w:type="dxa" w:w="60"/>
+              <w:left w:type="dxa" w:w="100"/>
+              <w:bottom w:type="dxa" w:w="60"/>
+              <w:right w:type="dxa" w:w="100"/>
+            </w:tcMar>
+          </w:tcPr>
+          <w:p>
+            <w:r>
+              <w:rPr>
+                <w:rFonts w:ascii="Consolas" w:cs="Consolas" w:eastAsia="Consolas" w:hAnsi="Consolas"/>
+                <w:sz w:val="19"/>
+                <w:szCs w:val="19"/>
+              </w:rPr>
+              <w:t xml:space="preserve">Home-Assist/boitier/</w:t>
+            </w:r>
+            <w:r>
+              <w:t xml:space="preserve"> (boîte + couvercle, PETG)</w:t>
             </w:r>
           </w:p>
         </w:tc>
@@ -2848,67 +2856,209 @@
         </w:trPr>
         <w:tc>
           <w:tcPr>
-            <w:tcW w:type="dxa" w:w="3641"/>
-            <w:tcBorders>
-              <w:top w:val="single" w:color="999999" w:sz="4"/>
-              <w:left w:val="single" w:color="999999" w:sz="4"/>
-              <w:bottom w:val="single" w:color="999999" w:sz="4"/>
-              <w:right w:val="single" w:color="999999" w:sz="4"/>
-            </w:tcBorders>
-            <w:tcMar>
-              <w:top w:type="dxa" w:w="60"/>
-              <w:left w:type="dxa" w:w="100"/>
-              <w:bottom w:type="dxa" w:w="60"/>
-              <w:right w:type="dxa" w:w="100"/>
-            </w:tcMar>
-          </w:tcPr>
-          <w:p>
-            <w:r>
-              <w:t xml:space="preserve">Boîtier imprimé en 3D</w:t>
-            </w:r>
-          </w:p>
-        </w:tc>
-        <w:tc>
-          <w:tcPr>
-            <w:tcW w:type="dxa" w:w="286"/>
-            <w:tcBorders>
-              <w:top w:val="single" w:color="999999" w:sz="4"/>
-              <w:left w:val="single" w:color="999999" w:sz="4"/>
-              <w:bottom w:val="single" w:color="999999" w:sz="4"/>
-              <w:right w:val="single" w:color="999999" w:sz="4"/>
-            </w:tcBorders>
-            <w:tcMar>
-              <w:top w:type="dxa" w:w="60"/>
-              <w:left w:type="dxa" w:w="100"/>
-              <w:bottom w:type="dxa" w:w="60"/>
-              <w:right w:type="dxa" w:w="100"/>
-            </w:tcMar>
-          </w:tcPr>
-          <w:p>
-            <w:r>
-              <w:t xml:space="preserve">1</w:t>
-            </w:r>
-          </w:p>
-        </w:tc>
-        <w:tc>
-          <w:tcPr>
-            <w:tcW w:type="dxa" w:w="5711"/>
-            <w:tcBorders>
-              <w:top w:val="single" w:color="999999" w:sz="4"/>
-              <w:left w:val="single" w:color="999999" w:sz="4"/>
-              <w:bottom w:val="single" w:color="999999" w:sz="4"/>
-              <w:right w:val="single" w:color="999999" w:sz="4"/>
-            </w:tcBorders>
-            <w:tcMar>
-              <w:top w:type="dxa" w:w="60"/>
-              <w:left w:type="dxa" w:w="100"/>
-              <w:bottom w:type="dxa" w:w="60"/>
-              <w:right w:type="dxa" w:w="100"/>
-            </w:tcMar>
-          </w:tcPr>
-          <w:p>
-            <w:r>
-              <w:t xml:space="preserve">à dessiner</w:t>
+            <w:tcW w:type="dxa" w:w="3234"/>
+            <w:tcBorders>
+              <w:top w:val="single" w:color="999999" w:sz="4"/>
+              <w:left w:val="single" w:color="999999" w:sz="4"/>
+              <w:bottom w:val="single" w:color="999999" w:sz="4"/>
+              <w:right w:val="single" w:color="999999" w:sz="4"/>
+            </w:tcBorders>
+            <w:tcMar>
+              <w:top w:type="dxa" w:w="60"/>
+              <w:left w:type="dxa" w:w="100"/>
+              <w:bottom w:type="dxa" w:w="60"/>
+              <w:right w:type="dxa" w:w="100"/>
+            </w:tcMar>
+          </w:tcPr>
+          <w:p>
+            <w:r>
+              <w:t xml:space="preserve">Vis M3 × 8 (couvercle)</w:t>
+            </w:r>
+          </w:p>
+        </w:tc>
+        <w:tc>
+          <w:tcPr>
+            <w:tcW w:type="dxa" w:w="254"/>
+            <w:tcBorders>
+              <w:top w:val="single" w:color="999999" w:sz="4"/>
+              <w:left w:val="single" w:color="999999" w:sz="4"/>
+              <w:bottom w:val="single" w:color="999999" w:sz="4"/>
+              <w:right w:val="single" w:color="999999" w:sz="4"/>
+            </w:tcBorders>
+            <w:tcMar>
+              <w:top w:type="dxa" w:w="60"/>
+              <w:left w:type="dxa" w:w="100"/>
+              <w:bottom w:type="dxa" w:w="60"/>
+              <w:right w:type="dxa" w:w="100"/>
+            </w:tcMar>
+          </w:tcPr>
+          <w:p>
+            <w:r>
+              <w:t xml:space="preserve">4</w:t>
+            </w:r>
+          </w:p>
+        </w:tc>
+        <w:tc>
+          <w:tcPr>
+            <w:tcW w:type="dxa" w:w="6150"/>
+            <w:tcBorders>
+              <w:top w:val="single" w:color="999999" w:sz="4"/>
+              <w:left w:val="single" w:color="999999" w:sz="4"/>
+              <w:bottom w:val="single" w:color="999999" w:sz="4"/>
+              <w:right w:val="single" w:color="999999" w:sz="4"/>
+            </w:tcBorders>
+            <w:tcMar>
+              <w:top w:type="dxa" w:w="60"/>
+              <w:left w:type="dxa" w:w="100"/>
+              <w:bottom w:type="dxa" w:w="60"/>
+              <w:right w:type="dxa" w:w="100"/>
+            </w:tcMar>
+          </w:tcPr>
+          <w:p>
+            <w:r>
+              <w:t xml:space="preserve">dans les colonnes des coins</w:t>
+            </w:r>
+          </w:p>
+        </w:tc>
+      </w:tr>
+      <w:tr>
+        <w:trPr>
+          <w:tblHeader w:val="off"/>
+        </w:trPr>
+        <w:tc>
+          <w:tcPr>
+            <w:tcW w:type="dxa" w:w="3234"/>
+            <w:tcBorders>
+              <w:top w:val="single" w:color="999999" w:sz="4"/>
+              <w:left w:val="single" w:color="999999" w:sz="4"/>
+              <w:bottom w:val="single" w:color="999999" w:sz="4"/>
+              <w:right w:val="single" w:color="999999" w:sz="4"/>
+            </w:tcBorders>
+            <w:tcMar>
+              <w:top w:type="dxa" w:w="60"/>
+              <w:left w:type="dxa" w:w="100"/>
+              <w:bottom w:type="dxa" w:w="60"/>
+              <w:right w:type="dxa" w:w="100"/>
+            </w:tcMar>
+          </w:tcPr>
+          <w:p>
+            <w:r>
+              <w:t xml:space="preserve">Vis à bois Ø 4 tête fraisée</w:t>
+            </w:r>
+          </w:p>
+        </w:tc>
+        <w:tc>
+          <w:tcPr>
+            <w:tcW w:type="dxa" w:w="254"/>
+            <w:tcBorders>
+              <w:top w:val="single" w:color="999999" w:sz="4"/>
+              <w:left w:val="single" w:color="999999" w:sz="4"/>
+              <w:bottom w:val="single" w:color="999999" w:sz="4"/>
+              <w:right w:val="single" w:color="999999" w:sz="4"/>
+            </w:tcBorders>
+            <w:tcMar>
+              <w:top w:type="dxa" w:w="60"/>
+              <w:left w:type="dxa" w:w="100"/>
+              <w:bottom w:type="dxa" w:w="60"/>
+              <w:right w:type="dxa" w:w="100"/>
+            </w:tcMar>
+          </w:tcPr>
+          <w:p>
+            <w:r>
+              <w:t xml:space="preserve">2</w:t>
+            </w:r>
+          </w:p>
+        </w:tc>
+        <w:tc>
+          <w:tcPr>
+            <w:tcW w:type="dxa" w:w="6150"/>
+            <w:tcBorders>
+              <w:top w:val="single" w:color="999999" w:sz="4"/>
+              <w:left w:val="single" w:color="999999" w:sz="4"/>
+              <w:bottom w:val="single" w:color="999999" w:sz="4"/>
+              <w:right w:val="single" w:color="999999" w:sz="4"/>
+            </w:tcBorders>
+            <w:tcMar>
+              <w:top w:type="dxa" w:w="60"/>
+              <w:left w:type="dxa" w:w="100"/>
+              <w:bottom w:type="dxa" w:w="60"/>
+              <w:right w:type="dxa" w:w="100"/>
+            </w:tcMar>
+          </w:tcPr>
+          <w:p>
+            <w:r>
+              <w:t xml:space="preserve">oreilles, si le boîtier est fixé à l'étagère</w:t>
+            </w:r>
+          </w:p>
+        </w:tc>
+      </w:tr>
+      <w:tr>
+        <w:trPr>
+          <w:tblHeader w:val="off"/>
+        </w:trPr>
+        <w:tc>
+          <w:tcPr>
+            <w:tcW w:type="dxa" w:w="3234"/>
+            <w:tcBorders>
+              <w:top w:val="single" w:color="999999" w:sz="4"/>
+              <w:left w:val="single" w:color="999999" w:sz="4"/>
+              <w:bottom w:val="single" w:color="999999" w:sz="4"/>
+              <w:right w:val="single" w:color="999999" w:sz="4"/>
+            </w:tcBorders>
+            <w:tcMar>
+              <w:top w:type="dxa" w:w="60"/>
+              <w:left w:type="dxa" w:w="100"/>
+              <w:bottom w:type="dxa" w:w="60"/>
+              <w:right w:type="dxa" w:w="100"/>
+            </w:tcMar>
+          </w:tcPr>
+          <w:p>
+            <w:r>
+              <w:t xml:space="preserve">Patins caoutchouc adhésifs</w:t>
+            </w:r>
+          </w:p>
+        </w:tc>
+        <w:tc>
+          <w:tcPr>
+            <w:tcW w:type="dxa" w:w="254"/>
+            <w:tcBorders>
+              <w:top w:val="single" w:color="999999" w:sz="4"/>
+              <w:left w:val="single" w:color="999999" w:sz="4"/>
+              <w:bottom w:val="single" w:color="999999" w:sz="4"/>
+              <w:right w:val="single" w:color="999999" w:sz="4"/>
+            </w:tcBorders>
+            <w:tcMar>
+              <w:top w:type="dxa" w:w="60"/>
+              <w:left w:type="dxa" w:w="100"/>
+              <w:bottom w:type="dxa" w:w="60"/>
+              <w:right w:type="dxa" w:w="100"/>
+            </w:tcMar>
+          </w:tcPr>
+          <w:p>
+            <w:r>
+              <w:t xml:space="preserve">4</w:t>
+            </w:r>
+          </w:p>
+        </w:tc>
+        <w:tc>
+          <w:tcPr>
+            <w:tcW w:type="dxa" w:w="6150"/>
+            <w:tcBorders>
+              <w:top w:val="single" w:color="999999" w:sz="4"/>
+              <w:left w:val="single" w:color="999999" w:sz="4"/>
+              <w:bottom w:val="single" w:color="999999" w:sz="4"/>
+              <w:right w:val="single" w:color="999999" w:sz="4"/>
+            </w:tcBorders>
+            <w:tcMar>
+              <w:top w:type="dxa" w:w="60"/>
+              <w:left w:type="dxa" w:w="100"/>
+              <w:bottom w:type="dxa" w:w="60"/>
+              <w:right w:type="dxa" w:w="100"/>
+            </w:tcMar>
+          </w:tcPr>
+          <w:p>
+            <w:r>
+              <w:t xml:space="preserve">sous le fond</w:t>
             </w:r>
           </w:p>
         </w:tc>

</xml_diff>